<commit_message>
Report HTMT only for discriminant validity; drop Fornell-Larcker table; add Henseler reference
Co-Authored-By: Claude Sonnet 5.5 <noreply@anthropic.com>
Claude-Session: https://claude.ai/code/session_011skRsoVAYeuETrASczAhSt
</commit_message>
<xml_diff>
--- a/output/paper_journal_format.docx
+++ b/output/paper_journal_format.docx
@@ -6767,708 +6767,11 @@
     </w:p>
     <w:p>
       <w:pPr>
-        <w:pStyle w:val="a6"/>
-        <w:keepNext/>
-        <w:spacing w:before="160" w:after="60"/>
-        <w:ind w:left="0" w:right="0"/>
-        <w:jc w:val="center"/>
-      </w:pPr>
-      <w:r>
-        <w:rPr>
-          <w:rFonts w:ascii="Times New Roman" w:hAnsi="Times New Roman" w:cs="B Mitra"/>
-          <w:b/>
-          <w:bCs/>
-          <w:sz w:val="20"/>
-          <w:szCs w:val="20"/>
-          <w:rtl/>
-        </w:rPr>
-        <w:t xml:space="preserve">جدول ۲. روایی تمایز به روش فورن</w:t>
-      </w:r>
-      <w:r>
-        <w:rPr>
-          <w:rFonts w:ascii="Times New Roman" w:hAnsi="Times New Roman" w:cs="B Mitra"/>
-          <w:b/>
-          <w:bCs/>
-          <w:sz w:val="20"/>
-          <w:szCs w:val="20"/>
-          <w:rtl/>
-        </w:rPr>
-        <w:t>ل</w:t>
-      </w:r>
-      <w:r>
-        <w:rPr>
-          <w:rFonts w:ascii="Times New Roman" w:hAnsi="Times New Roman" w:cs="B Mitra"/>
-          <w:b/>
-          <w:bCs/>
-          <w:sz w:val="20"/>
-          <w:szCs w:val="20"/>
-          <w:rtl/>
-        </w:rPr>
-        <w:t xml:space="preserve"> - </w:t>
-      </w:r>
-      <w:r>
-        <w:rPr>
-          <w:rFonts w:ascii="Times New Roman" w:hAnsi="Times New Roman" w:cs="B Mitra"/>
-          <w:b/>
-          <w:bCs/>
-          <w:sz w:val="20"/>
-          <w:szCs w:val="20"/>
-          <w:rtl/>
-        </w:rPr>
-        <w:t>لارکر</w:t>
-      </w:r>
-    </w:p>
-    <w:tbl>
-      <w:tblPr>
-        <w:tblStyle w:val="PlainTable1"/>
-        <w:bidiVisual/>
-        <w:tblW w:w="5000" w:type="pct"/>
-        <w:tblLook w:val="04A0" w:firstRow="1" w:lastRow="0" w:firstColumn="1" w:lastColumn="0" w:noHBand="0" w:noVBand="1"/>
-      </w:tblPr>
-      <w:tblGrid>
-        <w:gridCol w:w="2128"/>
-        <w:gridCol w:w="1757"/>
-        <w:gridCol w:w="1605"/>
-        <w:gridCol w:w="1468"/>
-        <w:gridCol w:w="2059"/>
-      </w:tblGrid>
-      <w:tr>
-        <w:trPr>
-          <w:cnfStyle w:val="100000000000" w:firstRow="1" w:lastRow="0" w:firstColumn="0" w:lastColumn="0" w:oddVBand="0" w:evenVBand="0" w:oddHBand="0" w:evenHBand="0" w:firstRowFirstColumn="0" w:firstRowLastColumn="0" w:lastRowFirstColumn="0" w:lastRowLastColumn="0"/>
-        </w:trPr>
-        <w:tc>
-          <w:tcPr>
-            <w:cnfStyle w:val="001000000000" w:firstRow="0" w:lastRow="0" w:firstColumn="1" w:lastColumn="0" w:oddVBand="0" w:evenVBand="0" w:oddHBand="0" w:evenHBand="0" w:firstRowFirstColumn="0" w:firstRowLastColumn="0" w:lastRowFirstColumn="0" w:lastRowLastColumn="0"/>
-            <w:tcW w:w="1180" w:type="pct"/>
-            <w:vAlign w:val="center"/>
-            <w:hideMark/>
-          </w:tcPr>
-          <w:p>
-            <w:pPr>
-              <w:spacing w:before="20" w:after="20"/>
-              <w:jc w:val="center"/>
-            </w:pPr>
-            <w:r>
-              <w:rPr>
-                <w:rFonts w:ascii="Times New Roman" w:hAnsi="Times New Roman" w:cs="B Mitra"/>
-                <w:b/>
-                <w:bCs/>
-                <w:sz w:val="16"/>
-                <w:szCs w:val="20"/>
-                <w:rtl/>
-              </w:rPr>
-              <w:t>سازه پنهان</w:t>
-            </w:r>
-          </w:p>
-        </w:tc>
-        <w:tc>
-          <w:tcPr>
-            <w:tcW w:w="974" w:type="pct"/>
-            <w:vAlign w:val="center"/>
-            <w:hideMark/>
-          </w:tcPr>
-          <w:p>
-            <w:pPr>
-              <w:spacing w:before="20" w:after="20"/>
-              <w:jc w:val="center"/>
-            </w:pPr>
-            <w:r>
-              <w:rPr>
-                <w:rFonts w:ascii="Times New Roman" w:hAnsi="Times New Roman" w:cs="B Mitra"/>
-                <w:b/>
-                <w:bCs/>
-                <w:sz w:val="16"/>
-                <w:szCs w:val="20"/>
-                <w:rtl/>
-              </w:rPr>
-              <w:t>خستگی عاطفی</w:t>
-            </w:r>
-          </w:p>
-        </w:tc>
-        <w:tc>
-          <w:tcPr>
-            <w:tcW w:w="890" w:type="pct"/>
-            <w:vAlign w:val="center"/>
-            <w:hideMark/>
-          </w:tcPr>
-          <w:p>
-            <w:pPr>
-              <w:spacing w:before="20" w:after="20"/>
-              <w:jc w:val="center"/>
-            </w:pPr>
-            <w:r>
-              <w:rPr>
-                <w:rFonts w:ascii="Times New Roman" w:hAnsi="Times New Roman" w:cs="B Mitra"/>
-                <w:b/>
-                <w:bCs/>
-                <w:sz w:val="16"/>
-                <w:szCs w:val="20"/>
-                <w:rtl/>
-              </w:rPr>
-              <w:t>تقاضای شغلی</w:t>
-            </w:r>
-          </w:p>
-        </w:tc>
-        <w:tc>
-          <w:tcPr>
-            <w:tcW w:w="814" w:type="pct"/>
-            <w:vAlign w:val="center"/>
-            <w:hideMark/>
-          </w:tcPr>
-          <w:p>
-            <w:pPr>
-              <w:spacing w:before="20" w:after="20"/>
-              <w:jc w:val="center"/>
-            </w:pPr>
-            <w:r>
-              <w:rPr>
-                <w:rFonts w:ascii="Times New Roman" w:hAnsi="Times New Roman" w:cs="B Mitra"/>
-                <w:b/>
-                <w:bCs/>
-                <w:sz w:val="16"/>
-                <w:szCs w:val="20"/>
-                <w:rtl/>
-              </w:rPr>
-              <w:t>تعهد عاطفی</w:t>
-            </w:r>
-          </w:p>
-        </w:tc>
-        <w:tc>
-          <w:tcPr>
-            <w:tcW w:w="1142" w:type="pct"/>
-            <w:vAlign w:val="center"/>
-            <w:hideMark/>
-          </w:tcPr>
-          <w:p>
-            <w:pPr>
-              <w:spacing w:before="20" w:after="20"/>
-              <w:jc w:val="center"/>
-            </w:pPr>
-            <w:r>
-              <w:rPr>
-                <w:rFonts w:ascii="Times New Roman" w:hAnsi="Times New Roman" w:cs="B Mitra"/>
-                <w:b/>
-                <w:bCs/>
-                <w:sz w:val="16"/>
-                <w:szCs w:val="20"/>
-                <w:rtl/>
-              </w:rPr>
-              <w:t>نقایص کارگروهی</w:t>
-            </w:r>
-          </w:p>
-        </w:tc>
-      </w:tr>
-      <w:tr>
-        <w:trPr>
-          <w:cnfStyle w:val="000000100000" w:firstRow="0" w:lastRow="0" w:firstColumn="0" w:lastColumn="0" w:oddVBand="0" w:evenVBand="0" w:oddHBand="1" w:evenHBand="0" w:firstRowFirstColumn="0" w:firstRowLastColumn="0" w:lastRowFirstColumn="0" w:lastRowLastColumn="0"/>
-        </w:trPr>
-        <w:tc>
-          <w:tcPr>
-            <w:cnfStyle w:val="001000000000" w:firstRow="0" w:lastRow="0" w:firstColumn="1" w:lastColumn="0" w:oddVBand="0" w:evenVBand="0" w:oddHBand="0" w:evenHBand="0" w:firstRowFirstColumn="0" w:firstRowLastColumn="0" w:lastRowFirstColumn="0" w:lastRowLastColumn="0"/>
-            <w:tcW w:w="1180" w:type="pct"/>
-            <w:vAlign w:val="center"/>
-            <w:hideMark/>
-          </w:tcPr>
-          <w:p>
-            <w:pPr>
-              <w:spacing w:before="20" w:after="20"/>
-              <w:jc w:val="center"/>
-            </w:pPr>
-            <w:r>
-              <w:rPr>
-                <w:rFonts w:ascii="Times New Roman" w:hAnsi="Times New Roman" w:cs="B Mitra"/>
-                <w:sz w:val="16"/>
-                <w:szCs w:val="20"/>
-                <w:rtl/>
-              </w:rPr>
-              <w:t>خستگی عاطفی</w:t>
-            </w:r>
-          </w:p>
-        </w:tc>
-        <w:tc>
-          <w:tcPr>
-            <w:tcW w:w="974" w:type="pct"/>
-            <w:vAlign w:val="center"/>
-            <w:hideMark/>
-          </w:tcPr>
-          <w:p>
-            <w:pPr>
-              <w:spacing w:before="20" w:after="20"/>
-              <w:jc w:val="center"/>
-            </w:pPr>
-            <w:r>
-              <w:rPr>
-                <w:rFonts w:ascii="Times New Roman" w:hAnsi="Times New Roman" w:cs="B Mitra"/>
-                <w:sz w:val="16"/>
-                <w:szCs w:val="20"/>
-                <w:rtl/>
-              </w:rPr>
-              <w:t xml:space="preserve"> (</w:t>
-            </w:r>
-            <w:r>
-              <w:rPr>
-                <w:rFonts w:ascii="Times New Roman" w:hAnsi="Times New Roman" w:cs="B Mitra"/>
-                <w:sz w:val="16"/>
-                <w:szCs w:val="20"/>
-                <w:rtl/>
-              </w:rPr>
-              <w:t>۰/۶۷۹</w:t>
-            </w:r>
-            <w:r>
-              <w:rPr>
-                <w:rFonts w:ascii="Times New Roman" w:hAnsi="Times New Roman" w:cs="B Mitra"/>
-                <w:sz w:val="16"/>
-                <w:szCs w:val="20"/>
-                <w:rtl/>
-              </w:rPr>
-              <w:t>)</w:t>
-            </w:r>
-          </w:p>
-        </w:tc>
-        <w:tc>
-          <w:tcPr>
-            <w:tcW w:w="890" w:type="pct"/>
-            <w:vAlign w:val="center"/>
-            <w:hideMark/>
-          </w:tcPr>
-          <w:p>
-            <w:pPr>
-              <w:spacing w:before="20" w:after="20"/>
-              <w:jc w:val="center"/>
-            </w:pPr>
-          </w:p>
-        </w:tc>
-        <w:tc>
-          <w:tcPr>
-            <w:tcW w:w="814" w:type="pct"/>
-            <w:vAlign w:val="center"/>
-            <w:hideMark/>
-          </w:tcPr>
-          <w:p>
-            <w:pPr>
-              <w:spacing w:before="20" w:after="20"/>
-              <w:jc w:val="center"/>
-            </w:pPr>
-          </w:p>
-        </w:tc>
-        <w:tc>
-          <w:tcPr>
-            <w:tcW w:w="1142" w:type="pct"/>
-            <w:vAlign w:val="center"/>
-            <w:hideMark/>
-          </w:tcPr>
-          <w:p>
-            <w:pPr>
-              <w:spacing w:before="20" w:after="20"/>
-              <w:jc w:val="center"/>
-            </w:pPr>
-          </w:p>
-        </w:tc>
-      </w:tr>
-      <w:tr>
-        <w:tc>
-          <w:tcPr>
-            <w:cnfStyle w:val="001000000000" w:firstRow="0" w:lastRow="0" w:firstColumn="1" w:lastColumn="0" w:oddVBand="0" w:evenVBand="0" w:oddHBand="0" w:evenHBand="0" w:firstRowFirstColumn="0" w:firstRowLastColumn="0" w:lastRowFirstColumn="0" w:lastRowLastColumn="0"/>
-            <w:tcW w:w="1180" w:type="pct"/>
-            <w:vAlign w:val="center"/>
-            <w:hideMark/>
-          </w:tcPr>
-          <w:p>
-            <w:pPr>
-              <w:spacing w:before="20" w:after="20"/>
-              <w:jc w:val="center"/>
-            </w:pPr>
-            <w:r>
-              <w:rPr>
-                <w:rFonts w:ascii="Times New Roman" w:hAnsi="Times New Roman" w:cs="B Mitra"/>
-                <w:sz w:val="16"/>
-                <w:szCs w:val="20"/>
-                <w:rtl/>
-              </w:rPr>
-              <w:t>تقاضای شغلی</w:t>
-            </w:r>
-          </w:p>
-        </w:tc>
-        <w:tc>
-          <w:tcPr>
-            <w:tcW w:w="974" w:type="pct"/>
-            <w:vAlign w:val="center"/>
-            <w:hideMark/>
-          </w:tcPr>
-          <w:p>
-            <w:pPr>
-              <w:spacing w:before="20" w:after="20"/>
-              <w:jc w:val="center"/>
-            </w:pPr>
-            <w:r>
-              <w:rPr>
-                <w:rFonts w:ascii="Times New Roman" w:hAnsi="Times New Roman" w:cs="B Mitra"/>
-                <w:sz w:val="16"/>
-                <w:szCs w:val="20"/>
-                <w:rtl/>
-              </w:rPr>
-              <w:t>۰/۳۶۲</w:t>
-            </w:r>
-          </w:p>
-        </w:tc>
-        <w:tc>
-          <w:tcPr>
-            <w:tcW w:w="890" w:type="pct"/>
-            <w:vAlign w:val="center"/>
-            <w:hideMark/>
-          </w:tcPr>
-          <w:p>
-            <w:pPr>
-              <w:spacing w:before="20" w:after="20"/>
-              <w:jc w:val="center"/>
-            </w:pPr>
-            <w:r>
-              <w:rPr>
-                <w:rFonts w:ascii="Times New Roman" w:hAnsi="Times New Roman" w:cs="B Mitra"/>
-                <w:sz w:val="16"/>
-                <w:szCs w:val="20"/>
-                <w:rtl/>
-              </w:rPr>
-              <w:t xml:space="preserve"> (</w:t>
-            </w:r>
-            <w:r>
-              <w:rPr>
-                <w:rFonts w:ascii="Times New Roman" w:hAnsi="Times New Roman" w:cs="B Mitra"/>
-                <w:sz w:val="16"/>
-                <w:szCs w:val="20"/>
-                <w:rtl/>
-              </w:rPr>
-              <w:t>۰/۷۵۶</w:t>
-            </w:r>
-            <w:r>
-              <w:rPr>
-                <w:rFonts w:ascii="Times New Roman" w:hAnsi="Times New Roman" w:cs="B Mitra"/>
-                <w:sz w:val="16"/>
-                <w:szCs w:val="20"/>
-                <w:rtl/>
-              </w:rPr>
-              <w:t>)</w:t>
-            </w:r>
-          </w:p>
-        </w:tc>
-        <w:tc>
-          <w:tcPr>
-            <w:tcW w:w="814" w:type="pct"/>
-            <w:vAlign w:val="center"/>
-            <w:hideMark/>
-          </w:tcPr>
-          <w:p>
-            <w:pPr>
-              <w:spacing w:before="20" w:after="20"/>
-              <w:jc w:val="center"/>
-            </w:pPr>
-          </w:p>
-        </w:tc>
-        <w:tc>
-          <w:tcPr>
-            <w:tcW w:w="1142" w:type="pct"/>
-            <w:vAlign w:val="center"/>
-            <w:hideMark/>
-          </w:tcPr>
-          <w:p>
-            <w:pPr>
-              <w:spacing w:before="20" w:after="20"/>
-              <w:jc w:val="center"/>
-            </w:pPr>
-          </w:p>
-        </w:tc>
-      </w:tr>
-      <w:tr>
-        <w:trPr>
-          <w:cnfStyle w:val="000000100000" w:firstRow="0" w:lastRow="0" w:firstColumn="0" w:lastColumn="0" w:oddVBand="0" w:evenVBand="0" w:oddHBand="1" w:evenHBand="0" w:firstRowFirstColumn="0" w:firstRowLastColumn="0" w:lastRowFirstColumn="0" w:lastRowLastColumn="0"/>
-        </w:trPr>
-        <w:tc>
-          <w:tcPr>
-            <w:cnfStyle w:val="001000000000" w:firstRow="0" w:lastRow="0" w:firstColumn="1" w:lastColumn="0" w:oddVBand="0" w:evenVBand="0" w:oddHBand="0" w:evenHBand="0" w:firstRowFirstColumn="0" w:firstRowLastColumn="0" w:lastRowFirstColumn="0" w:lastRowLastColumn="0"/>
-            <w:tcW w:w="1180" w:type="pct"/>
-            <w:vAlign w:val="center"/>
-            <w:hideMark/>
-          </w:tcPr>
-          <w:p>
-            <w:pPr>
-              <w:spacing w:before="20" w:after="20"/>
-              <w:jc w:val="center"/>
-            </w:pPr>
-            <w:r>
-              <w:rPr>
-                <w:rFonts w:ascii="Times New Roman" w:hAnsi="Times New Roman" w:cs="B Mitra"/>
-                <w:sz w:val="16"/>
-                <w:szCs w:val="20"/>
-                <w:rtl/>
-              </w:rPr>
-              <w:t>تعهد عاطفی</w:t>
-            </w:r>
-          </w:p>
-        </w:tc>
-        <w:tc>
-          <w:tcPr>
-            <w:tcW w:w="974" w:type="pct"/>
-            <w:vAlign w:val="center"/>
-            <w:hideMark/>
-          </w:tcPr>
-          <w:p>
-            <w:pPr>
-              <w:spacing w:before="20" w:after="20"/>
-              <w:jc w:val="center"/>
-            </w:pPr>
-            <w:r>
-              <w:rPr>
-                <w:rFonts w:ascii="Times New Roman" w:hAnsi="Times New Roman" w:cs="B Mitra"/>
-                <w:sz w:val="16"/>
-                <w:szCs w:val="20"/>
-                <w:rtl/>
-              </w:rPr>
-              <w:t>۰/۲۳۰</w:t>
-            </w:r>
-          </w:p>
-        </w:tc>
-        <w:tc>
-          <w:tcPr>
-            <w:tcW w:w="890" w:type="pct"/>
-            <w:vAlign w:val="center"/>
-            <w:hideMark/>
-          </w:tcPr>
-          <w:p>
-            <w:pPr>
-              <w:spacing w:before="20" w:after="20"/>
-              <w:jc w:val="center"/>
-            </w:pPr>
-            <w:r>
-              <w:rPr>
-                <w:rFonts w:ascii="Times New Roman" w:hAnsi="Times New Roman" w:cs="B Mitra"/>
-                <w:sz w:val="16"/>
-                <w:szCs w:val="20"/>
-                <w:rtl/>
-              </w:rPr>
-              <w:t>۰/۰۴۲</w:t>
-            </w:r>
-            <w:r>
-              <w:rPr>
-                <w:rFonts w:ascii="Times New Roman" w:hAnsi="Times New Roman" w:cs="B Mitra"/>
-                <w:sz w:val="16"/>
-                <w:szCs w:val="20"/>
-                <w:rtl/>
-              </w:rPr>
-              <w:t>-</w:t>
-            </w:r>
-          </w:p>
-        </w:tc>
-        <w:tc>
-          <w:tcPr>
-            <w:tcW w:w="814" w:type="pct"/>
-            <w:vAlign w:val="center"/>
-            <w:hideMark/>
-          </w:tcPr>
-          <w:p>
-            <w:pPr>
-              <w:spacing w:before="20" w:after="20"/>
-              <w:jc w:val="center"/>
-            </w:pPr>
-            <w:r>
-              <w:rPr>
-                <w:rFonts w:ascii="Times New Roman" w:hAnsi="Times New Roman" w:cs="B Mitra"/>
-                <w:sz w:val="16"/>
-                <w:szCs w:val="20"/>
-                <w:rtl/>
-              </w:rPr>
-              <w:t xml:space="preserve"> (</w:t>
-            </w:r>
-            <w:r>
-              <w:rPr>
-                <w:rFonts w:ascii="Times New Roman" w:hAnsi="Times New Roman" w:cs="B Mitra"/>
-                <w:sz w:val="16"/>
-                <w:szCs w:val="20"/>
-                <w:rtl/>
-              </w:rPr>
-              <w:t>۰/۷۷۱</w:t>
-            </w:r>
-            <w:r>
-              <w:rPr>
-                <w:rFonts w:ascii="Times New Roman" w:hAnsi="Times New Roman" w:cs="B Mitra"/>
-                <w:sz w:val="16"/>
-                <w:szCs w:val="20"/>
-                <w:rtl/>
-              </w:rPr>
-              <w:t>)</w:t>
-            </w:r>
-          </w:p>
-        </w:tc>
-        <w:tc>
-          <w:tcPr>
-            <w:tcW w:w="1142" w:type="pct"/>
-            <w:vAlign w:val="center"/>
-            <w:hideMark/>
-          </w:tcPr>
-          <w:p>
-            <w:pPr>
-              <w:spacing w:before="20" w:after="20"/>
-              <w:jc w:val="center"/>
-            </w:pPr>
-          </w:p>
-        </w:tc>
-      </w:tr>
-      <w:tr>
-        <w:tc>
-          <w:tcPr>
-            <w:cnfStyle w:val="001000000000" w:firstRow="0" w:lastRow="0" w:firstColumn="1" w:lastColumn="0" w:oddVBand="0" w:evenVBand="0" w:oddHBand="0" w:evenHBand="0" w:firstRowFirstColumn="0" w:firstRowLastColumn="0" w:lastRowFirstColumn="0" w:lastRowLastColumn="0"/>
-            <w:tcW w:w="1180" w:type="pct"/>
-            <w:vAlign w:val="center"/>
-            <w:hideMark/>
-          </w:tcPr>
-          <w:p>
-            <w:pPr>
-              <w:spacing w:before="20" w:after="20"/>
-              <w:jc w:val="center"/>
-            </w:pPr>
-            <w:r>
-              <w:rPr>
-                <w:rFonts w:ascii="Times New Roman" w:hAnsi="Times New Roman" w:cs="B Mitra"/>
-                <w:sz w:val="16"/>
-                <w:szCs w:val="20"/>
-                <w:rtl/>
-              </w:rPr>
-              <w:t>نقایص کارگروهی</w:t>
-            </w:r>
-          </w:p>
-        </w:tc>
-        <w:tc>
-          <w:tcPr>
-            <w:tcW w:w="974" w:type="pct"/>
-            <w:vAlign w:val="center"/>
-            <w:hideMark/>
-          </w:tcPr>
-          <w:p>
-            <w:pPr>
-              <w:spacing w:before="20" w:after="20"/>
-              <w:jc w:val="center"/>
-            </w:pPr>
-            <w:r>
-              <w:rPr>
-                <w:rFonts w:ascii="Times New Roman" w:hAnsi="Times New Roman" w:cs="B Mitra"/>
-                <w:sz w:val="16"/>
-                <w:szCs w:val="20"/>
-                <w:rtl/>
-              </w:rPr>
-              <w:t>۰/۳۷۲</w:t>
-            </w:r>
-          </w:p>
-        </w:tc>
-        <w:tc>
-          <w:tcPr>
-            <w:tcW w:w="890" w:type="pct"/>
-            <w:vAlign w:val="center"/>
-            <w:hideMark/>
-          </w:tcPr>
-          <w:p>
-            <w:pPr>
-              <w:spacing w:before="20" w:after="20"/>
-              <w:jc w:val="center"/>
-            </w:pPr>
-            <w:r>
-              <w:rPr>
-                <w:rFonts w:ascii="Times New Roman" w:hAnsi="Times New Roman" w:cs="B Mitra"/>
-                <w:sz w:val="16"/>
-                <w:szCs w:val="20"/>
-                <w:rtl/>
-              </w:rPr>
-              <w:t>۰/۱۵۶</w:t>
-            </w:r>
-            <w:r>
-              <w:rPr>
-                <w:rFonts w:ascii="Times New Roman" w:hAnsi="Times New Roman" w:cs="B Mitra"/>
-                <w:sz w:val="16"/>
-                <w:szCs w:val="20"/>
-                <w:rtl/>
-              </w:rPr>
-              <w:t>-</w:t>
-            </w:r>
-          </w:p>
-        </w:tc>
-        <w:tc>
-          <w:tcPr>
-            <w:tcW w:w="814" w:type="pct"/>
-            <w:vAlign w:val="center"/>
-          </w:tcPr>
-          <w:p>
-            <w:pPr>
-              <w:spacing w:before="20" w:after="20"/>
-              <w:jc w:val="center"/>
-            </w:pPr>
-            <w:r>
-              <w:rPr>
-                <w:rFonts w:ascii="Times New Roman" w:hAnsi="Times New Roman" w:cs="B Mitra"/>
-                <w:sz w:val="16"/>
-                <w:szCs w:val="20"/>
-                <w:rtl/>
-              </w:rPr>
-              <w:t>۰/۱۲۳</w:t>
-            </w:r>
-            <w:r>
-              <w:rPr>
-                <w:rFonts w:ascii="Times New Roman" w:hAnsi="Times New Roman" w:cs="B Mitra"/>
-                <w:sz w:val="16"/>
-                <w:szCs w:val="20"/>
-                <w:rtl/>
-              </w:rPr>
-              <w:t>-</w:t>
-            </w:r>
-          </w:p>
-        </w:tc>
-        <w:tc>
-          <w:tcPr>
-            <w:tcW w:w="1142" w:type="pct"/>
-            <w:vAlign w:val="center"/>
-            <w:hideMark/>
-          </w:tcPr>
-          <w:p>
-            <w:pPr>
-              <w:spacing w:before="20" w:after="20"/>
-              <w:jc w:val="center"/>
-            </w:pPr>
-            <w:r>
-              <w:rPr>
-                <w:rFonts w:ascii="Times New Roman" w:hAnsi="Times New Roman" w:cs="B Mitra"/>
-                <w:sz w:val="16"/>
-                <w:szCs w:val="20"/>
-                <w:rtl/>
-              </w:rPr>
-              <w:t xml:space="preserve"> (</w:t>
-            </w:r>
-            <w:r>
-              <w:rPr>
-                <w:rFonts w:ascii="Times New Roman" w:hAnsi="Times New Roman" w:cs="B Mitra"/>
-                <w:sz w:val="16"/>
-                <w:szCs w:val="20"/>
-                <w:rtl/>
-              </w:rPr>
-              <w:t>۰/۵۵۹</w:t>
-            </w:r>
-            <w:r>
-              <w:rPr>
-                <w:rFonts w:ascii="Times New Roman" w:hAnsi="Times New Roman" w:cs="B Mitra"/>
-                <w:sz w:val="16"/>
-                <w:szCs w:val="20"/>
-                <w:rtl/>
-              </w:rPr>
-              <w:t>)</w:t>
-            </w:r>
-          </w:p>
-        </w:tc>
-      </w:tr>
-    </w:tbl>
-    <w:p>
-      <w:pPr>
         <w:pStyle w:val="2"/>
-        <w:spacing w:before="180"/>
       </w:pPr>
       <w:r>
         <w:rPr/>
-        <w:t xml:space="preserve">جذر AVE هر سازه (جدول ۲) از همبستگی آن با سایر سازه‌ها بزرگ‌تر است و همه مقادیر HTMT کمتر از ۰/۸۵ است (بیشترین مقدار، ۰/۴۲۰، میان نقایص کارگروهی و خستگی عاطفی)؛ بنابراین روایی تمایز تأیید می‌شود.</w:t>
+        <w:t xml:space="preserve">از میان دو معیار یادشده، HTMT گزارش می‌شود: همه مقادیر HTMT میان سازه‌ها کمتر از آستانه ۰/۸۵ است (بیشترین مقدار، ۰/۴۲۰، میان نقایص کارگروهی و خستگی عاطفی)؛ بنابراین سازه‌ها از یکدیگر متمایزند (هنسلر، رینگل و سارستد، ۲۰۱۵).</w:t>
       </w:r>
     </w:p>
     <w:p>
@@ -7585,7 +6888,7 @@
           <w:szCs w:val="20"/>
           <w:rtl/>
         </w:rPr>
-        <w:t xml:space="preserve">جدول ۳.</w:t>
+        <w:t xml:space="preserve">جدول ۲.</w:t>
       </w:r>
       <w:r>
         <w:rPr>
@@ -8673,7 +7976,7 @@
       </w:pPr>
       <w:r>
         <w:rPr/>
-        <w:t xml:space="preserve">ضرایب مسیر استاندارد، آماره t و سطح معناداری در جدول ۴ و ضرایب مسیر استانداردشده مدل در شکل ۲ آمده است.</w:t>
+        <w:t xml:space="preserve">ضرایب مسیر استاندارد، آماره t و سطح معناداری در جدول ۳ و ضرایب مسیر استانداردشده مدل در شکل ۲ آمده است.</w:t>
       </w:r>
     </w:p>
     <w:p>
@@ -8693,7 +7996,7 @@
           <w:szCs w:val="20"/>
           <w:rtl/>
         </w:rPr>
-        <w:t xml:space="preserve">جدول ۴.</w:t>
+        <w:t xml:space="preserve">جدول ۳.</w:t>
       </w:r>
       <w:r>
         <w:rPr>
@@ -13385,6 +12688,39 @@
           <w:sz w:val="22"/>
           <w:szCs w:val="22"/>
         </w:rPr>
+        <w:t xml:space="preserve">Henseler, J., Ringle, C. M., &amp; Sarstedt, M. (2015). A new criterion for assessing discriminant validity in variance-based structural equation modeling. </w:t>
+      </w:r>
+      <w:r>
+        <w:rPr>
+          <w:rFonts w:ascii="Times New Roman" w:hAnsi="Times New Roman" w:cs="Times New Roman"/>
+          <w:i/>
+          <w:iCs/>
+          <w:sz w:val="22"/>
+          <w:szCs w:val="22"/>
+        </w:rPr>
+        <w:t xml:space="preserve">Journal of the Academy of Marketing Science, 43</w:t>
+      </w:r>
+      <w:r>
+        <w:rPr>
+          <w:rFonts w:ascii="Times New Roman" w:hAnsi="Times New Roman" w:cs="Times New Roman"/>
+          <w:sz w:val="22"/>
+          <w:szCs w:val="22"/>
+        </w:rPr>
+        <w:t xml:space="preserve">(1), 115–135. https://doi.org/10.1007/s11747-014-0403-8</w:t>
+      </w:r>
+    </w:p>
+    <w:p>
+      <w:pPr>
+        <w:bidi w:val="0"/>
+        <w:ind w:left="510" w:hanging="510"/>
+        <w:jc w:val="both"/>
+      </w:pPr>
+      <w:r>
+        <w:rPr>
+          <w:rFonts w:ascii="Times New Roman" w:hAnsi="Times New Roman" w:cs="Times New Roman"/>
+          <w:sz w:val="22"/>
+          <w:szCs w:val="22"/>
+        </w:rPr>
         <w:t xml:space="preserve">Herda, D. N., &amp; Lavelle, J. J. (2012). The auditor-audit firm relationship and its effect on burnout and turnover intention. </w:t>
       </w:r>
       <w:r>

</xml_diff>

<commit_message>
Add verified source for dark side of affective commitment claim
Co-Authored-By: Claude Sonnet 5.5 <noreply@anthropic.com>
Claude-Session: https://claude.ai/code/session_011skRsoVAYeuETrASczAhSt
</commit_message>
<xml_diff>
--- a/output/paper_journal_format.docx
+++ b/output/paper_journal_format.docx
@@ -864,6 +864,10 @@
           <w:rtl/>
         </w:rPr>
         <w:t xml:space="preserve">.</w:t>
+      </w:r>
+      <w:r>
+        <w:rPr/>
+        <w:t xml:space="preserve"> شواهد تجربی نیز نشان می‌دهد تعهد عاطفی بالا می‌تواند اثر محافظتی اخلاق فردی در برابر فرسودگی را تضعیف کند (سانتیاگو-تورنر، کورال-مارفیل و تارّاتس-پونس، ۲۰۲۴).</w:t>
       </w:r>
     </w:p>
     <w:p>
@@ -13706,6 +13710,39 @@
           <w:sz w:val="22"/>
           <w:szCs w:val="22"/>
         </w:rPr>
+        <w:t xml:space="preserve">Santiago-Torner, C., Corral-Marfil, J.-A., &amp; Tarrats-Pons, E. (2024). Relationship between personal ethics and burnout: The unexpected influence of affective commitment. </w:t>
+      </w:r>
+      <w:r>
+        <w:rPr>
+          <w:rFonts w:ascii="Times New Roman" w:hAnsi="Times New Roman" w:cs="Times New Roman"/>
+          <w:i/>
+          <w:iCs/>
+          <w:sz w:val="22"/>
+          <w:szCs w:val="22"/>
+        </w:rPr>
+        <w:t xml:space="preserve">Administrative Sciences, 14</w:t>
+      </w:r>
+      <w:r>
+        <w:rPr>
+          <w:rFonts w:ascii="Times New Roman" w:hAnsi="Times New Roman" w:cs="Times New Roman"/>
+          <w:sz w:val="22"/>
+          <w:szCs w:val="22"/>
+        </w:rPr>
+        <w:t xml:space="preserve">(6), 123. https://doi.org/10.3390/admsci14060123</w:t>
+      </w:r>
+    </w:p>
+    <w:p>
+      <w:pPr>
+        <w:bidi w:val="0"/>
+        <w:ind w:left="510" w:hanging="510"/>
+        <w:jc w:val="both"/>
+      </w:pPr>
+      <w:r>
+        <w:rPr>
+          <w:rFonts w:ascii="Times New Roman" w:hAnsi="Times New Roman" w:cs="Times New Roman"/>
+          <w:sz w:val="22"/>
+          <w:szCs w:val="22"/>
+        </w:rPr>
         <w:t xml:space="preserve">Schaufeli, W. B., &amp; Bakker, A. B. (2004). Job demands, job resources, and their relationship with burnout and engagement: A multi-sample study. </w:t>
       </w:r>
       <w:r>

</xml_diff>